<commit_message>
docs(lab04): align final test evidence and delivery record
</commit_message>
<xml_diff>
--- a/docs/Звіт_ЛР_4_фінальний.docx
+++ b/docs/Звіт_ЛР_4_фінальний.docx
@@ -340,47 +340,9 @@
             <w:vAlign w:val="center"/>
           </w:tcPr>
           <w:p>
-            <w:pPr>
-              <w:pStyle w:val="ReportTable"/>
-              <w:keepLines/>
-            </w:pPr>
-            <w:proofErr w:type="spellStart"/>
-            <w:r>
-              <w:t>Build</w:t>
-            </w:r>
-            <w:proofErr w:type="spellEnd"/>
-            <w:r>
-              <w:t xml:space="preserve"> </w:t>
-            </w:r>
-            <w:proofErr w:type="spellStart"/>
-            <w:r>
-              <w:t>succeeded</w:t>
-            </w:r>
-            <w:proofErr w:type="spellEnd"/>
-            <w:r>
-              <w:t xml:space="preserve">; 0 </w:t>
-            </w:r>
-            <w:proofErr w:type="spellStart"/>
-            <w:r>
-              <w:t>warning</w:t>
-            </w:r>
-            <w:proofErr w:type="spellEnd"/>
-            <w:r>
-              <w:t xml:space="preserve">, 0 </w:t>
-            </w:r>
-            <w:proofErr w:type="spellStart"/>
-            <w:r>
-              <w:t>error</w:t>
-            </w:r>
-            <w:proofErr w:type="spellEnd"/>
-            <w:r>
-              <w:t xml:space="preserve">; 99/99 </w:t>
-            </w:r>
-            <w:proofErr w:type="spellStart"/>
-            <w:r>
-              <w:t>passed</w:t>
-            </w:r>
-            <w:proofErr w:type="spellEnd"/>
+            <w:r>
+              <w:t>Build succeeded; 0 warning, 0 error; 101/101 passed</w:t>
+            </w:r>
           </w:p>
         </w:tc>
         <w:tc>
@@ -20400,14 +20362,12 @@
         <w:wordWrap w:val="0"/>
       </w:pPr>
       <w:r>
-        <w:t>64889c11 (triage fix) → … → 93d15b10 (документація) → … → d3c398d (delete і direct child) → v0.4.0</w:t>
-        <w:br/>
-        <w:t>vulnerable_is_ancestor_of_v0_4_0=false</w:t>
-      </w:r>
-    </w:p>
-    <w:p>
-      <w:r>
-        <w:t>Commit 64889c11 є предком 93d15b10, отже 93d15b10 вже містить triage fix. Він не є ціллю фінального тегу: після нього додано direct child endpoint і delete, а повний isolated run із 101 успішним тестом виконано після цих змін.</w:t>
+        <w:t>Git-ланцюжок: 64889c11 (triage fix) → 93d15b10 (документація) → d3c398d930c7d3ccd97882f38519a3cb02b59338 (DELETE і direct child) → v0.4.0; vulnerable_is_ancestor_of_v0_4_0=false.</w:t>
+      </w:r>
+    </w:p>
+    <w:p>
+      <w:r>
+        <w:t>Commit 64889c11 є предком 93d15b10, отже 93d15b10 уже містить triage fix. Повний implementation fixed hash d3c398d930c7d3ccd97882f38519a3cb02b59338 фіксує саме додані DELETE та direct child endpoint. Він не є ціллю фінального тегу: тег містить пізніші документи й докази того самого fixed state.</w:t>
       </w:r>
     </w:p>
     <w:p>
@@ -20418,12 +20378,12 @@
         <w:wordWrap w:val="0"/>
       </w:pPr>
       <w:r>
-        <w:t>Фінальний безпечний стан знаходиться у:\nbranch: lab/4-authorization\ntag:    v0.4.0\ncommit: визначається командою git show --no-patch v0.4.0</w:t>
-      </w:r>
-    </w:p>
-    <w:p>
-      <w:r>
-        <w:t>Отже, v0.4.0 вказує на реально перевірений fixed state, не містить vulnerable endpoint і не використовується для демонстрації PoC.</w:t>
+        <w:t>Фінальний безпечний стан: branch lab/4-authorization; annotated tag v0.4.0; implementation fixed commit d3c398d930c7d3ccd97882f38519a3cb02b59338.</w:t>
+      </w:r>
+    </w:p>
+    <w:p>
+      <w:r>
+        <w:t>Отже, v0.4.0 позначає реально перевірений fixed state, не містить vulnerable endpoint і не використовується для демонстрації PoC.</w:t>
       </w:r>
     </w:p>
     <w:p>
@@ -33736,143 +33696,7 @@
     </w:p>
     <w:p>
       <w:r>
-        <w:t xml:space="preserve">Подія містить лише </w:t>
-      </w:r>
-      <w:proofErr w:type="spellStart"/>
-      <w:r>
-        <w:t>EventName</w:t>
-      </w:r>
-      <w:proofErr w:type="spellEnd"/>
-      <w:r>
-        <w:t xml:space="preserve">, </w:t>
-      </w:r>
-      <w:proofErr w:type="spellStart"/>
-      <w:r>
-        <w:t>Operation</w:t>
-      </w:r>
-      <w:proofErr w:type="spellEnd"/>
-      <w:r>
-        <w:t xml:space="preserve">, </w:t>
-      </w:r>
-      <w:proofErr w:type="spellStart"/>
-      <w:r>
-        <w:t>ActorUserId</w:t>
-      </w:r>
-      <w:proofErr w:type="spellEnd"/>
-      <w:r>
-        <w:t xml:space="preserve">, </w:t>
-      </w:r>
-      <w:proofErr w:type="spellStart"/>
-      <w:r>
-        <w:t>IncidentId</w:t>
-      </w:r>
-      <w:proofErr w:type="spellEnd"/>
-      <w:r>
-        <w:t xml:space="preserve">, </w:t>
-      </w:r>
-      <w:proofErr w:type="spellStart"/>
-      <w:r>
-        <w:t>Result</w:t>
-      </w:r>
-      <w:proofErr w:type="spellEnd"/>
-      <w:r>
-        <w:t xml:space="preserve">, </w:t>
-      </w:r>
-      <w:proofErr w:type="spellStart"/>
-      <w:r>
-        <w:t>OccurredAtUtc</w:t>
-      </w:r>
-      <w:proofErr w:type="spellEnd"/>
-      <w:r>
-        <w:t xml:space="preserve"> і </w:t>
-      </w:r>
-      <w:proofErr w:type="spellStart"/>
-      <w:r>
-        <w:t>TraceId</w:t>
-      </w:r>
-      <w:proofErr w:type="spellEnd"/>
-      <w:r>
-        <w:t xml:space="preserve">. Пароль, </w:t>
-      </w:r>
-      <w:proofErr w:type="spellStart"/>
-      <w:r>
-        <w:t>cookie</w:t>
-      </w:r>
-      <w:proofErr w:type="spellEnd"/>
-      <w:r>
-        <w:t xml:space="preserve">, </w:t>
-      </w:r>
-      <w:proofErr w:type="spellStart"/>
-      <w:r>
-        <w:t>token</w:t>
-      </w:r>
-      <w:proofErr w:type="spellEnd"/>
-      <w:r>
-        <w:t xml:space="preserve">, повне </w:t>
-      </w:r>
-      <w:proofErr w:type="spellStart"/>
-      <w:r>
-        <w:t>request</w:t>
-      </w:r>
-      <w:proofErr w:type="spellEnd"/>
-      <w:r>
-        <w:t xml:space="preserve"> </w:t>
-      </w:r>
-      <w:proofErr w:type="spellStart"/>
-      <w:r>
-        <w:t>body</w:t>
-      </w:r>
-      <w:proofErr w:type="spellEnd"/>
-      <w:r>
-        <w:t xml:space="preserve"> та </w:t>
-      </w:r>
-      <w:proofErr w:type="spellStart"/>
-      <w:r>
-        <w:t>stack</w:t>
-      </w:r>
-      <w:proofErr w:type="spellEnd"/>
-      <w:r>
-        <w:t xml:space="preserve"> </w:t>
-      </w:r>
-      <w:proofErr w:type="spellStart"/>
-      <w:r>
-        <w:t>trace</w:t>
-      </w:r>
-      <w:proofErr w:type="spellEnd"/>
-      <w:r>
-        <w:t xml:space="preserve"> не записуються. </w:t>
-      </w:r>
-      <w:proofErr w:type="spellStart"/>
-      <w:r>
-        <w:t>TraceId</w:t>
-      </w:r>
-      <w:proofErr w:type="spellEnd"/>
-      <w:r>
-        <w:t xml:space="preserve"> події дорівнює </w:t>
-      </w:r>
-      <w:proofErr w:type="spellStart"/>
-      <w:r>
-        <w:t>traceId</w:t>
-      </w:r>
-      <w:proofErr w:type="spellEnd"/>
-      <w:r>
-        <w:t xml:space="preserve"> </w:t>
-      </w:r>
-      <w:proofErr w:type="spellStart"/>
-      <w:r>
-        <w:t>Problem</w:t>
-      </w:r>
-      <w:proofErr w:type="spellEnd"/>
-      <w:r>
-        <w:t xml:space="preserve"> </w:t>
-      </w:r>
-      <w:proofErr w:type="spellStart"/>
-      <w:r>
-        <w:t>Details</w:t>
-      </w:r>
-      <w:proofErr w:type="spellEnd"/>
-      <w:r>
-        <w:t xml:space="preserve"> у відповіді клієнтові.</w:t>
+        <w:t>Подія містить лише EventName, Operation, ActorUserId, IncidentId, Result, OccurredAtUtc і TraceId. Назва incident.triage.denied описує доменну дію та її наслідок: відмовлено саме у privileged transition Incident.Triage. Загальна назва authorization.denied втратила б контекст Incident і конкретної операції; authorization outcome окремо й однозначно подано у Result=Denied. Пароль, cookie, token, повне request body та stack trace не записуються. TraceId події дорівнює traceId Problem Details у відповіді клієнтові.</w:t>
       </w:r>
     </w:p>
     <w:p>
@@ -38096,71 +37920,7 @@
     </w:p>
     <w:p>
       <w:r>
-        <w:t xml:space="preserve">Перевірку виконано 20.10.2026 у конфігурації </w:t>
-      </w:r>
-      <w:proofErr w:type="spellStart"/>
-      <w:r>
-        <w:t>Release</w:t>
-      </w:r>
-      <w:proofErr w:type="spellEnd"/>
-      <w:r>
-        <w:t xml:space="preserve">, SDK 10.0.402, на окремій тимчасовій </w:t>
-      </w:r>
-      <w:proofErr w:type="spellStart"/>
-      <w:r>
-        <w:t>PostgreSQL</w:t>
-      </w:r>
-      <w:proofErr w:type="spellEnd"/>
-      <w:r>
-        <w:t xml:space="preserve">-базі через API localhost:5096. Вона охоплює поточний </w:t>
-      </w:r>
-      <w:proofErr w:type="spellStart"/>
-      <w:r>
-        <w:t>working</w:t>
-      </w:r>
-      <w:proofErr w:type="spellEnd"/>
-      <w:r>
-        <w:t xml:space="preserve"> </w:t>
-      </w:r>
-      <w:proofErr w:type="spellStart"/>
-      <w:r>
-        <w:t>tree</w:t>
-      </w:r>
-      <w:proofErr w:type="spellEnd"/>
-      <w:r>
-        <w:t xml:space="preserve"> поверх </w:t>
-      </w:r>
-      <w:proofErr w:type="spellStart"/>
-      <w:r>
-        <w:t>commit</w:t>
-      </w:r>
-      <w:proofErr w:type="spellEnd"/>
-      <w:r>
-        <w:t xml:space="preserve"> 4b5f1ead25289c5827d2bcf01f6710414fcaa16b, включно з останніми змінами </w:t>
-      </w:r>
-      <w:proofErr w:type="spellStart"/>
-      <w:r>
-        <w:t>CookieClient.cs</w:t>
-      </w:r>
-      <w:proofErr w:type="spellEnd"/>
-      <w:r>
-        <w:t xml:space="preserve"> та </w:t>
-      </w:r>
-      <w:proofErr w:type="spellStart"/>
-      <w:r>
-        <w:t>IdentityRegistrationFailureTests.cs</w:t>
-      </w:r>
-      <w:proofErr w:type="spellEnd"/>
-      <w:r>
-        <w:t xml:space="preserve">. SHA256 цих файлів зафіксовано в </w:t>
-      </w:r>
-      <w:proofErr w:type="spellStart"/>
-      <w:r>
-        <w:t>логу</w:t>
-      </w:r>
-      <w:proofErr w:type="spellEnd"/>
-      <w:r>
-        <w:t xml:space="preserve"> й повторно звірено перед оформленням доказу.</w:t>
+        <w:t>Перевірку виконано 21.10.2026 у конфігурації Release, SDK 10.0.402, на окремій тимчасовій PostgreSQL-базі через API localhost:5084. Скрипт build/test запускав fixed implementation з DELETE та direct child endpoint, зафіксовану повним hash d3c398d930c7d3ccd97882f38519a3cb02b59338. Робоча база проєкту не використовувалася.</w:t>
       </w:r>
     </w:p>
     <w:p>
@@ -38168,7 +37928,6 @@
         <w:keepNext/>
       </w:pPr>
       <w:r>
-        <w:lastRenderedPageBreak/>
         <w:t>Виконані команди:</w:t>
       </w:r>
     </w:p>
@@ -38178,239 +37937,19 @@
         <w:keepLines/>
       </w:pPr>
       <w:r>
-        <w:t>$</w:t>
-      </w:r>
-      <w:proofErr w:type="spellStart"/>
-      <w:r>
-        <w:t>artifacts</w:t>
-      </w:r>
-      <w:proofErr w:type="spellEnd"/>
-      <w:r>
-        <w:t xml:space="preserve"> = '</w:t>
-      </w:r>
-      <w:proofErr w:type="spellStart"/>
-      <w:r>
-        <w:t>tmp</w:t>
-      </w:r>
-      <w:proofErr w:type="spellEnd"/>
-      <w:r>
-        <w:t>\lab04-poc-596487352901424cb9dc579bb9959884\</w:t>
-      </w:r>
-      <w:proofErr w:type="spellStart"/>
-      <w:r>
-        <w:t>artifacts</w:t>
-      </w:r>
-      <w:proofErr w:type="spellEnd"/>
-      <w:r>
-        <w:t>'</w:t>
-      </w:r>
-      <w:r>
-        <w:br/>
-      </w:r>
-      <w:proofErr w:type="spellStart"/>
-      <w:r>
-        <w:t>dotnet</w:t>
-      </w:r>
-      <w:proofErr w:type="spellEnd"/>
-      <w:r>
-        <w:t xml:space="preserve"> </w:t>
-      </w:r>
-      <w:proofErr w:type="spellStart"/>
-      <w:r>
-        <w:t>build</w:t>
-      </w:r>
-      <w:proofErr w:type="spellEnd"/>
-      <w:r>
-        <w:t xml:space="preserve"> SecureLab.sln -c </w:t>
-      </w:r>
-      <w:proofErr w:type="spellStart"/>
-      <w:r>
-        <w:t>Release</w:t>
-      </w:r>
-      <w:proofErr w:type="spellEnd"/>
-      <w:r>
-        <w:t xml:space="preserve"> --</w:t>
-      </w:r>
-      <w:proofErr w:type="spellStart"/>
-      <w:r>
-        <w:t>artifacts-path</w:t>
-      </w:r>
-      <w:proofErr w:type="spellEnd"/>
-      <w:r>
-        <w:t xml:space="preserve"> $</w:t>
-      </w:r>
-      <w:proofErr w:type="spellStart"/>
-      <w:r>
-        <w:t>artifacts</w:t>
-      </w:r>
-      <w:proofErr w:type="spellEnd"/>
-      <w:r>
-        <w:t xml:space="preserve"> -</w:t>
-      </w:r>
-      <w:proofErr w:type="spellStart"/>
-      <w:r>
-        <w:t>p:RestoreLockedMode</w:t>
-      </w:r>
-      <w:proofErr w:type="spellEnd"/>
-      <w:r>
-        <w:t>=</w:t>
-      </w:r>
-      <w:proofErr w:type="spellStart"/>
-      <w:r>
-        <w:t>true</w:t>
-      </w:r>
-      <w:proofErr w:type="spellEnd"/>
-      <w:r>
-        <w:br/>
-      </w:r>
-      <w:proofErr w:type="spellStart"/>
-      <w:r>
-        <w:t>dotnet</w:t>
-      </w:r>
-      <w:proofErr w:type="spellEnd"/>
-      <w:r>
-        <w:t xml:space="preserve"> </w:t>
-      </w:r>
-      <w:proofErr w:type="spellStart"/>
-      <w:r>
-        <w:t>test</w:t>
-      </w:r>
-      <w:proofErr w:type="spellEnd"/>
-      <w:r>
-        <w:t xml:space="preserve"> </w:t>
-      </w:r>
-      <w:proofErr w:type="spellStart"/>
-      <w:r>
-        <w:t>tests</w:t>
-      </w:r>
-      <w:proofErr w:type="spellEnd"/>
-      <w:r>
-        <w:t>/</w:t>
-      </w:r>
-      <w:proofErr w:type="spellStart"/>
-      <w:r>
-        <w:t>SecureLab.Api.Tests</w:t>
-      </w:r>
-      <w:proofErr w:type="spellEnd"/>
-      <w:r>
-        <w:t>/</w:t>
-      </w:r>
-      <w:proofErr w:type="spellStart"/>
-      <w:r>
-        <w:t>SecureLab.Api.Tests.csproj</w:t>
-      </w:r>
-      <w:proofErr w:type="spellEnd"/>
-      <w:r>
-        <w:t xml:space="preserve"> -c </w:t>
-      </w:r>
-      <w:proofErr w:type="spellStart"/>
-      <w:r>
-        <w:t>Release</w:t>
-      </w:r>
-      <w:proofErr w:type="spellEnd"/>
-      <w:r>
-        <w:t xml:space="preserve"> --</w:t>
-      </w:r>
-      <w:proofErr w:type="spellStart"/>
-      <w:r>
-        <w:t>no-build</w:t>
-      </w:r>
-      <w:proofErr w:type="spellEnd"/>
-      <w:r>
-        <w:t xml:space="preserve"> --</w:t>
-      </w:r>
-      <w:proofErr w:type="spellStart"/>
-      <w:r>
-        <w:t>artifacts-path</w:t>
-      </w:r>
-      <w:proofErr w:type="spellEnd"/>
-      <w:r>
-        <w:t xml:space="preserve"> $</w:t>
-      </w:r>
-      <w:proofErr w:type="spellStart"/>
-      <w:r>
-        <w:t>artifacts</w:t>
-      </w:r>
-      <w:proofErr w:type="spellEnd"/>
-      <w:r>
-        <w:t xml:space="preserve"> --</w:t>
-      </w:r>
-      <w:proofErr w:type="spellStart"/>
-      <w:r>
-        <w:t>logger</w:t>
-      </w:r>
-      <w:proofErr w:type="spellEnd"/>
-      <w:r>
-        <w:t xml:space="preserve"> "</w:t>
-      </w:r>
-      <w:proofErr w:type="spellStart"/>
-      <w:r>
-        <w:t>trx;LogFileName</w:t>
-      </w:r>
-      <w:proofErr w:type="spellEnd"/>
-      <w:r>
-        <w:t>=lab04-latest.trx" --</w:t>
-      </w:r>
-      <w:proofErr w:type="spellStart"/>
-      <w:r>
-        <w:t>results-directory</w:t>
-      </w:r>
-      <w:proofErr w:type="spellEnd"/>
-      <w:r>
-        <w:t xml:space="preserve"> </w:t>
-      </w:r>
-      <w:proofErr w:type="spellStart"/>
-      <w:r>
-        <w:t>docs</w:t>
-      </w:r>
-      <w:proofErr w:type="spellEnd"/>
-      <w:r>
-        <w:t>/</w:t>
-      </w:r>
-      <w:proofErr w:type="spellStart"/>
-      <w:r>
-        <w:t>evidence</w:t>
-      </w:r>
-      <w:proofErr w:type="spellEnd"/>
-      <w:r>
-        <w:t>/</w:t>
-      </w:r>
-      <w:proofErr w:type="spellStart"/>
-      <w:r>
-        <w:t>test-results</w:t>
-      </w:r>
-      <w:proofErr w:type="spellEnd"/>
+        <w:t>$artifacts = 'tmp\lab04-poc-&lt;random&gt;\artifacts'</w:t>
+        <w:br/>
+        <w:t>dotnet build SecureLab.sln -c Release --artifacts-path $artifacts -p:RestoreLockedMode=true</w:t>
+        <w:br/>
+        <w:t>dotnet test tests/SecureLab.Api.Tests/SecureLab.Api.Tests.csproj -c Release --no-build --artifacts-path $artifacts --logger "trx;LogFileName=lab04-latest.trx" --results-directory docs/evidence/test-results</w:t>
+      </w:r>
     </w:p>
     <w:p>
       <w:pPr>
         <w:keepNext/>
       </w:pPr>
       <w:r>
-        <w:t xml:space="preserve">Фактичний вивід </w:t>
-      </w:r>
-      <w:proofErr w:type="spellStart"/>
-      <w:r>
-        <w:t>build</w:t>
-      </w:r>
-      <w:proofErr w:type="spellEnd"/>
-      <w:r>
-        <w:t xml:space="preserve"> і </w:t>
-      </w:r>
-      <w:proofErr w:type="spellStart"/>
-      <w:r>
-        <w:t>dotnet</w:t>
-      </w:r>
-      <w:proofErr w:type="spellEnd"/>
-      <w:r>
-        <w:t xml:space="preserve"> </w:t>
-      </w:r>
-      <w:proofErr w:type="spellStart"/>
-      <w:r>
-        <w:t>test</w:t>
-      </w:r>
-      <w:proofErr w:type="spellEnd"/>
-      <w:r>
-        <w:t>:</w:t>
+        <w:t>Фактичний вивід build і dotnet test:</w:t>
       </w:r>
     </w:p>
     <w:p>
@@ -38418,144 +37957,20 @@
         <w:pStyle w:val="Code"/>
         <w:keepLines/>
       </w:pPr>
-      <w:proofErr w:type="spellStart"/>
-      <w:r>
-        <w:t>Build</w:t>
-      </w:r>
-      <w:proofErr w:type="spellEnd"/>
-      <w:r>
-        <w:t xml:space="preserve"> </w:t>
-      </w:r>
-      <w:proofErr w:type="spellStart"/>
-      <w:r>
-        <w:t>succeeded</w:t>
-      </w:r>
-      <w:proofErr w:type="spellEnd"/>
-      <w:r>
-        <w:t>.</w:t>
-      </w:r>
-      <w:r>
-        <w:br/>
-        <w:t xml:space="preserve">    0 </w:t>
-      </w:r>
-      <w:proofErr w:type="spellStart"/>
-      <w:r>
-        <w:t>Warning</w:t>
-      </w:r>
-      <w:proofErr w:type="spellEnd"/>
-      <w:r>
-        <w:t>(s)</w:t>
-      </w:r>
-      <w:r>
-        <w:br/>
-        <w:t xml:space="preserve">    0 </w:t>
-      </w:r>
-      <w:proofErr w:type="spellStart"/>
-      <w:r>
-        <w:t>Error</w:t>
-      </w:r>
-      <w:proofErr w:type="spellEnd"/>
-      <w:r>
-        <w:t>(s)</w:t>
-      </w:r>
-      <w:r>
-        <w:br/>
-      </w:r>
-      <w:r>
-        <w:br/>
-      </w:r>
-      <w:proofErr w:type="spellStart"/>
-      <w:r>
-        <w:t>Passed</w:t>
-      </w:r>
-      <w:proofErr w:type="spellEnd"/>
-      <w:r>
-        <w:t xml:space="preserve">!  - </w:t>
-      </w:r>
-      <w:proofErr w:type="spellStart"/>
-      <w:r>
-        <w:t>Failed</w:t>
-      </w:r>
-      <w:proofErr w:type="spellEnd"/>
-      <w:r>
-        <w:t xml:space="preserve">:     0, </w:t>
-      </w:r>
-      <w:proofErr w:type="spellStart"/>
-      <w:r>
-        <w:t>Passed</w:t>
-      </w:r>
-      <w:proofErr w:type="spellEnd"/>
-      <w:r>
-        <w:t xml:space="preserve">:    99, </w:t>
-      </w:r>
-      <w:proofErr w:type="spellStart"/>
-      <w:r>
-        <w:t>Skipped</w:t>
-      </w:r>
-      <w:proofErr w:type="spellEnd"/>
-      <w:r>
-        <w:t xml:space="preserve">:     0, </w:t>
-      </w:r>
-      <w:proofErr w:type="spellStart"/>
-      <w:r>
-        <w:t>Total</w:t>
-      </w:r>
-      <w:proofErr w:type="spellEnd"/>
-      <w:r>
-        <w:t xml:space="preserve">:    99, </w:t>
-      </w:r>
-      <w:proofErr w:type="spellStart"/>
-      <w:r>
-        <w:t>Duration</w:t>
-      </w:r>
-      <w:proofErr w:type="spellEnd"/>
-      <w:r>
-        <w:t>: 13 s - SecureLab.Api.Tests.dll (net10.0)</w:t>
-      </w:r>
-    </w:p>
-    <w:p>
-      <w:r>
-        <w:t xml:space="preserve">Підсумок TRX: </w:t>
-      </w:r>
-      <w:proofErr w:type="spellStart"/>
-      <w:r>
-        <w:t>total</w:t>
-      </w:r>
-      <w:proofErr w:type="spellEnd"/>
-      <w:r>
-        <w:t xml:space="preserve">=99, </w:t>
-      </w:r>
-      <w:proofErr w:type="spellStart"/>
-      <w:r>
-        <w:t>executed</w:t>
-      </w:r>
-      <w:proofErr w:type="spellEnd"/>
-      <w:r>
-        <w:t xml:space="preserve">=99, </w:t>
-      </w:r>
-      <w:proofErr w:type="spellStart"/>
-      <w:r>
-        <w:t>passed</w:t>
-      </w:r>
-      <w:proofErr w:type="spellEnd"/>
-      <w:r>
-        <w:t xml:space="preserve">=99, </w:t>
-      </w:r>
-      <w:proofErr w:type="spellStart"/>
-      <w:r>
-        <w:t>failed</w:t>
-      </w:r>
-      <w:proofErr w:type="spellEnd"/>
-      <w:r>
-        <w:t xml:space="preserve">=0, </w:t>
-      </w:r>
-      <w:proofErr w:type="spellStart"/>
-      <w:r>
-        <w:t>notExecuted</w:t>
-      </w:r>
-      <w:proofErr w:type="spellEnd"/>
-      <w:r>
-        <w:t>=0. Отже, пройшли 99 тестів, провалених і пропущених немає.</w:t>
+      <w:r>
+        <w:t>Build succeeded.</w:t>
+        <w:br/>
+        <w:t xml:space="preserve">    0 Warning(s)</w:t>
+        <w:br/>
+        <w:t xml:space="preserve">    0 Error(s)</w:t>
+        <w:br/>
+        <w:br/>
+        <w:t>Passed!  - Failed:     0, Passed:   101, Skipped:     0, Total:   101, Duration: 14 s - SecureLab.Api.Tests.dll (net10.0)</w:t>
+      </w:r>
+    </w:p>
+    <w:p>
+      <w:r>
+        <w:t>Підсумок TRX: total=101, executed=101, passed=101, failed=0, error=0, notExecuted=0. Файл docs/evidence/test-results/lab04-latest.trx записано 21.10.2026 о 14:01:32. Отже, пройшов 101 тест, провалених і пропущених немає.</w:t>
       </w:r>
     </w:p>
     <w:p>
@@ -38563,143 +37978,7 @@
         <w:keepNext/>
       </w:pPr>
       <w:r>
-        <w:t xml:space="preserve">Після тестів </w:t>
-      </w:r>
-      <w:proofErr w:type="spellStart"/>
-      <w:r>
-        <w:t>повторено</w:t>
-      </w:r>
-      <w:proofErr w:type="spellEnd"/>
-      <w:r>
-        <w:t xml:space="preserve"> </w:t>
-      </w:r>
-      <w:proofErr w:type="spellStart"/>
-      <w:r>
-        <w:t>fixed</w:t>
-      </w:r>
-      <w:proofErr w:type="spellEnd"/>
-      <w:r>
-        <w:t xml:space="preserve"> </w:t>
-      </w:r>
-      <w:proofErr w:type="spellStart"/>
-      <w:r>
-        <w:t>PoC</w:t>
-      </w:r>
-      <w:proofErr w:type="spellEnd"/>
-      <w:r>
-        <w:t xml:space="preserve"> для </w:t>
-      </w:r>
-      <w:proofErr w:type="spellStart"/>
-      <w:r>
-        <w:t>details</w:t>
-      </w:r>
-      <w:proofErr w:type="spellEnd"/>
-      <w:r>
-        <w:t xml:space="preserve">, </w:t>
-      </w:r>
-      <w:proofErr w:type="spellStart"/>
-      <w:r>
-        <w:t>owner</w:t>
-      </w:r>
-      <w:proofErr w:type="spellEnd"/>
-      <w:r>
-        <w:t>/</w:t>
-      </w:r>
-      <w:proofErr w:type="spellStart"/>
-      <w:r>
-        <w:t>foreign</w:t>
-      </w:r>
-      <w:proofErr w:type="spellEnd"/>
-      <w:r>
-        <w:t xml:space="preserve"> </w:t>
-      </w:r>
-      <w:proofErr w:type="spellStart"/>
-      <w:r>
-        <w:t>update</w:t>
-      </w:r>
-      <w:proofErr w:type="spellEnd"/>
-      <w:r>
-        <w:t xml:space="preserve">, </w:t>
-      </w:r>
-      <w:proofErr w:type="spellStart"/>
-      <w:r>
-        <w:t>list</w:t>
-      </w:r>
-      <w:proofErr w:type="spellEnd"/>
-      <w:r>
-        <w:t xml:space="preserve">, обох </w:t>
-      </w:r>
-      <w:proofErr w:type="spellStart"/>
-      <w:r>
-        <w:t>search</w:t>
-      </w:r>
-      <w:proofErr w:type="spellEnd"/>
-      <w:r>
-        <w:t xml:space="preserve">-запитів, </w:t>
-      </w:r>
-      <w:proofErr w:type="spellStart"/>
-      <w:r>
-        <w:t>severity-summary</w:t>
-      </w:r>
-      <w:proofErr w:type="spellEnd"/>
-      <w:r>
-        <w:t xml:space="preserve">, A-10 і A-12; окремо </w:t>
-      </w:r>
-      <w:proofErr w:type="spellStart"/>
-      <w:r>
-        <w:t>повторено</w:t>
-      </w:r>
-      <w:proofErr w:type="spellEnd"/>
-      <w:r>
-        <w:t xml:space="preserve"> </w:t>
-      </w:r>
-      <w:proofErr w:type="spellStart"/>
-      <w:r>
-        <w:t>triage</w:t>
-      </w:r>
-      <w:proofErr w:type="spellEnd"/>
-      <w:r>
-        <w:t xml:space="preserve"> </w:t>
-      </w:r>
-      <w:proofErr w:type="spellStart"/>
-      <w:r>
-        <w:t>Reporter</w:t>
-      </w:r>
-      <w:proofErr w:type="spellEnd"/>
-      <w:r>
-        <w:t>/</w:t>
-      </w:r>
-      <w:proofErr w:type="spellStart"/>
-      <w:r>
-        <w:t>Analyst</w:t>
-      </w:r>
-      <w:proofErr w:type="spellEnd"/>
-      <w:r>
-        <w:t xml:space="preserve"> та звірено </w:t>
-      </w:r>
-      <w:proofErr w:type="spellStart"/>
-      <w:r>
-        <w:t>traceId</w:t>
-      </w:r>
-      <w:proofErr w:type="spellEnd"/>
-      <w:r>
-        <w:t xml:space="preserve"> </w:t>
-      </w:r>
-      <w:proofErr w:type="spellStart"/>
-      <w:r>
-        <w:t>audit</w:t>
-      </w:r>
-      <w:proofErr w:type="spellEnd"/>
-      <w:r>
-        <w:t xml:space="preserve">-події з відповіддю про відмову. Уривки фактичних </w:t>
-      </w:r>
-      <w:proofErr w:type="spellStart"/>
-      <w:r>
-        <w:t>логів</w:t>
-      </w:r>
-      <w:proofErr w:type="spellEnd"/>
-      <w:r>
-        <w:t>:</w:t>
+        <w:t>Після тестів повторено fixed PoC для details, owner/foreign update і delete, list, обох search-запитів, severity-summary, A-10 і direct child A-12; окремо повторено triage Reporter/Analyst та звірено traceId audit-події з відповіддю про відмову. Уривки фактичних логів:</w:t>
       </w:r>
     </w:p>
     <w:p>
@@ -38708,244 +37987,65 @@
         <w:keepLines/>
       </w:pPr>
       <w:r>
-        <w:t xml:space="preserve">A-10 </w:t>
-      </w:r>
-      <w:proofErr w:type="spellStart"/>
-      <w:r>
-        <w:t>normalized_bodies_equal</w:t>
-      </w:r>
-      <w:proofErr w:type="spellEnd"/>
-      <w:r>
-        <w:t>=</w:t>
-      </w:r>
-      <w:proofErr w:type="spellStart"/>
-      <w:r>
-        <w:t>true</w:t>
-      </w:r>
-      <w:proofErr w:type="spellEnd"/>
-      <w:r>
-        <w:br/>
-        <w:t>a11_summary_scope_verified=</w:t>
-      </w:r>
-      <w:proofErr w:type="spellStart"/>
-      <w:r>
-        <w:t>true</w:t>
-      </w:r>
-      <w:proofErr w:type="spellEnd"/>
-      <w:r>
-        <w:br/>
-      </w:r>
-      <w:proofErr w:type="spellStart"/>
-      <w:r>
-        <w:t>foreign_content_changed</w:t>
-      </w:r>
-      <w:proofErr w:type="spellEnd"/>
-      <w:r>
-        <w:t>=</w:t>
-      </w:r>
-      <w:proofErr w:type="spellStart"/>
-      <w:r>
-        <w:t>false</w:t>
-      </w:r>
-      <w:proofErr w:type="spellEnd"/>
-      <w:r>
-        <w:br/>
-      </w:r>
-      <w:proofErr w:type="spellStart"/>
-      <w:r>
-        <w:t>poc_checks</w:t>
-      </w:r>
-      <w:proofErr w:type="spellEnd"/>
-      <w:r>
-        <w:t>=</w:t>
-      </w:r>
-      <w:proofErr w:type="spellStart"/>
-      <w:r>
-        <w:t>passed</w:t>
-      </w:r>
-      <w:proofErr w:type="spellEnd"/>
-      <w:r>
-        <w:br/>
-        <w:t>a12_response_contract_verified=</w:t>
-      </w:r>
-      <w:proofErr w:type="spellStart"/>
-      <w:r>
-        <w:t>true</w:t>
-      </w:r>
-      <w:proofErr w:type="spellEnd"/>
-      <w:r>
-        <w:br/>
-      </w:r>
-      <w:proofErr w:type="spellStart"/>
-      <w:r>
-        <w:t>triage_fixed_contract_verified</w:t>
-      </w:r>
-      <w:proofErr w:type="spellEnd"/>
-      <w:r>
-        <w:t>=</w:t>
-      </w:r>
-      <w:proofErr w:type="spellStart"/>
-      <w:r>
-        <w:t>true</w:t>
-      </w:r>
-      <w:proofErr w:type="spellEnd"/>
-      <w:r>
-        <w:br/>
-      </w:r>
-      <w:proofErr w:type="spellStart"/>
-      <w:r>
-        <w:t>audit_trace_matches_response</w:t>
-      </w:r>
-      <w:proofErr w:type="spellEnd"/>
-      <w:r>
-        <w:t>=</w:t>
-      </w:r>
-      <w:proofErr w:type="spellStart"/>
-      <w:r>
-        <w:t>true</w:t>
-      </w:r>
-      <w:proofErr w:type="spellEnd"/>
-      <w:r>
-        <w:br/>
-      </w:r>
-      <w:proofErr w:type="spellStart"/>
-      <w:r>
-        <w:t>isolated_database_removed</w:t>
-      </w:r>
-      <w:proofErr w:type="spellEnd"/>
-      <w:r>
-        <w:t>=</w:t>
-      </w:r>
-      <w:proofErr w:type="spellStart"/>
-      <w:r>
-        <w:t>true</w:t>
-      </w:r>
-      <w:proofErr w:type="spellEnd"/>
+        <w:t>A-10 normalized_bodies_equal=true</w:t>
+        <w:br/>
+        <w:t>foreign_content_changed=false</w:t>
+        <w:br/>
+        <w:t>foreign_delete_state_unchanged=true</w:t>
+        <w:br/>
+        <w:t>owner_delete_verified=true</w:t>
+        <w:br/>
+        <w:t>a11_summary_scope_verified=true</w:t>
+        <w:br/>
+        <w:t>a12_child_parent_scope_and_internal_visibility_verified=true</w:t>
+        <w:br/>
+        <w:t>triage_fixed_contract_verified=true</w:t>
+        <w:br/>
+        <w:t>audit_trace_matches_response=true</w:t>
+        <w:br/>
+        <w:t>poc_checks=passed</w:t>
+        <w:br/>
+        <w:t>isolated_database_removed=true</w:t>
+      </w:r>
     </w:p>
     <w:p>
       <w:pPr>
         <w:pStyle w:val="Code"/>
         <w:keepLines/>
       </w:pPr>
-      <w:proofErr w:type="spellStart"/>
-      <w:r>
-        <w:t>Verification</w:t>
-      </w:r>
-      <w:proofErr w:type="spellEnd"/>
-      <w:r>
-        <w:t xml:space="preserve"> </w:t>
-      </w:r>
-      <w:proofErr w:type="spellStart"/>
-      <w:r>
-        <w:t>started</w:t>
-      </w:r>
-      <w:proofErr w:type="spellEnd"/>
-      <w:r>
-        <w:t>: 2026-10-20T15:50:05.0926959+03:00</w:t>
-      </w:r>
-      <w:r>
-        <w:br/>
-      </w:r>
-      <w:proofErr w:type="spellStart"/>
-      <w:r>
-        <w:t>Verification</w:t>
-      </w:r>
-      <w:proofErr w:type="spellEnd"/>
-      <w:r>
-        <w:t xml:space="preserve"> </w:t>
-      </w:r>
-      <w:proofErr w:type="spellStart"/>
-      <w:r>
-        <w:t>completed</w:t>
-      </w:r>
-      <w:proofErr w:type="spellEnd"/>
-      <w:r>
-        <w:t>: 2026-10-20T15:50:46.0813520+03:00</w:t>
-      </w:r>
-    </w:p>
-    <w:p>
-      <w:r>
-        <w:t xml:space="preserve">Повний вивід: </w:t>
-      </w:r>
-      <w:proofErr w:type="spellStart"/>
-      <w:r>
-        <w:t>docs</w:t>
-      </w:r>
-      <w:proofErr w:type="spellEnd"/>
-      <w:r>
-        <w:t>/</w:t>
-      </w:r>
-      <w:proofErr w:type="spellStart"/>
-      <w:r>
-        <w:t>evidence</w:t>
-      </w:r>
-      <w:proofErr w:type="spellEnd"/>
-      <w:r>
-        <w:t xml:space="preserve">/lab04-verification-latest.txt. Машинний результат: </w:t>
-      </w:r>
-      <w:proofErr w:type="spellStart"/>
-      <w:r>
-        <w:t>docs</w:t>
-      </w:r>
-      <w:proofErr w:type="spellEnd"/>
-      <w:r>
-        <w:t>/</w:t>
-      </w:r>
-      <w:proofErr w:type="spellStart"/>
-      <w:r>
-        <w:t>evidence</w:t>
-      </w:r>
-      <w:proofErr w:type="spellEnd"/>
-      <w:r>
-        <w:t>/</w:t>
-      </w:r>
-      <w:proofErr w:type="spellStart"/>
-      <w:r>
-        <w:t>test-results</w:t>
-      </w:r>
-      <w:proofErr w:type="spellEnd"/>
-      <w:r>
-        <w:t xml:space="preserve">/lab04-latest.trx. </w:t>
-      </w:r>
-      <w:proofErr w:type="spellStart"/>
-      <w:r>
-        <w:t>Triage</w:t>
-      </w:r>
-      <w:proofErr w:type="spellEnd"/>
-      <w:r>
-        <w:t xml:space="preserve"> та </w:t>
-      </w:r>
-      <w:proofErr w:type="spellStart"/>
-      <w:r>
-        <w:t>audit</w:t>
-      </w:r>
-      <w:proofErr w:type="spellEnd"/>
-      <w:r>
-        <w:t xml:space="preserve"> </w:t>
-      </w:r>
-      <w:proofErr w:type="spellStart"/>
-      <w:r>
-        <w:t>retest</w:t>
-      </w:r>
-      <w:proofErr w:type="spellEnd"/>
-      <w:r>
-        <w:t xml:space="preserve">: </w:t>
-      </w:r>
-      <w:proofErr w:type="spellStart"/>
-      <w:r>
-        <w:t>docs</w:t>
-      </w:r>
-      <w:proofErr w:type="spellEnd"/>
-      <w:r>
-        <w:t>/</w:t>
-      </w:r>
-      <w:proofErr w:type="spellStart"/>
-      <w:r>
-        <w:t>evidence</w:t>
-      </w:r>
-      <w:proofErr w:type="spellEnd"/>
-      <w:r>
-        <w:t>/lab04-triage-retest-latest.txt. Тимчасову базу після перевірки видалено; робочу базу проєкту не скидали.</w:t>
+      <w:r>
+        <w:t>Час артефактів цього запуску: TRX — 21.10.2026 14:01:32; fixed HTTP evidence — 14:01:38; triage/audit evidence — 14:01:39. Вони належать одному final fixed run після реалізації DELETE та direct child endpoint, а не старому run 20.10 на 99 тестів.</w:t>
+      </w:r>
+    </w:p>
+    <w:p>
+      <w:r>
+        <w:t>Повний вивід: docs/evidence/lab04-verification-latest.txt і docs/evidence/lab04-fixed.txt. Машинний результат: docs/evidence/test-results/lab04-latest.trx. Triage та audit retest: docs/evidence/lab04-triage-fixed.txt. Тимчасову базу після перевірки видалено; робочу базу проєкту не скидали.</w:t>
+      </w:r>
+    </w:p>
+    <w:p>
+      <w:pPr>
+        <w:pStyle w:val="Heading2"/>
+      </w:pPr>
+      <w:r>
+        <w:t>13.4. Передавання fixed state до GitHub</w:t>
+      </w:r>
+    </w:p>
+    <w:p>
+      <w:r>
+        <w:t>Публічний fixed ref: https://github.com/marchukmikola-source/securelab-starter/tree/lab/4-authorization . Передавання виконано прямим git push гілки lab/4-authorization та анотованого тегу v0.4.0. Merge request не створювався, а main не зливався: робота подається і перевіряється в ізольованій лабораторній гілці; це не є твердженням про deployment у main.</w:t>
+      </w:r>
+    </w:p>
+    <w:p>
+      <w:pPr>
+        <w:pStyle w:val="Heading2"/>
+      </w:pPr>
+      <w:r>
+        <w:t>13.5. Використання ШІ та перевірка матеріалу</w:t>
+      </w:r>
+    </w:p>
+    <w:p>
+      <w:r>
+        <w:t>Codex використовувався для звірення вимог, підготовки сценарію, реалізації та структурування доказів. Матеріал, запропонований ШІ, не приймався як доказ сам по собі: автор звірив контракти з методичкою, переглянув git diff, перевірив server-side decision у IncidentAccessRules та endpoint-ах, а висновки прийняв лише після HTTP, Browser, PowerShell і TRX запусків. Кожен суттєвий висновок має команду, status code, test або evidence-артефакт; секрети не передавалися у Git чи звіт.</w:t>
       </w:r>
     </w:p>
     <w:p>

</xml_diff>